<commit_message>
Added to weekly log
</commit_message>
<xml_diff>
--- a/WeeklyReport/WeeklyProjectLog-21-01-25.docx
+++ b/WeeklyReport/WeeklyProjectLog-21-01-25.docx
@@ -879,6 +879,14 @@
               </w:rPr>
               <w:t>Allow crud operation for admin</w:t>
             </w:r>
+            <w:r>
+              <w:rPr>
+                <w:rFonts w:asciiTheme="majorHAnsi" w:eastAsia="Times New Roman" w:hAnsiTheme="majorHAnsi" w:cstheme="majorHAnsi"/>
+                <w:sz w:val="24"/>
+                <w:szCs w:val="24"/>
+              </w:rPr>
+              <w:t xml:space="preserve"> from frontend with MRT v3</w:t>
+            </w:r>
           </w:p>
         </w:tc>
       </w:tr>
@@ -920,6 +928,14 @@
                 <w:szCs w:val="24"/>
               </w:rPr>
               <w:t>Allow basic changes for users</w:t>
+            </w:r>
+            <w:r>
+              <w:rPr>
+                <w:rFonts w:asciiTheme="majorHAnsi" w:eastAsia="Times New Roman" w:hAnsiTheme="majorHAnsi" w:cstheme="majorHAnsi"/>
+                <w:sz w:val="24"/>
+                <w:szCs w:val="24"/>
+              </w:rPr>
+              <w:t xml:space="preserve"> with MRT v3</w:t>
             </w:r>
           </w:p>
         </w:tc>

</xml_diff>